<commit_message>
Fix portfolio link in resume
</commit_message>
<xml_diff>
--- a/CV_Emmanuel_Zuniga.docx
+++ b/CV_Emmanuel_Zuniga.docx
@@ -121,31 +121,20 @@
           <w:sz w:val="24"/>
           <w:shd w:fill="auto" w:val="clear"/>
         </w:rPr>
-        <w:t xml:space="preserve">github.com/emzuka-cloud</w:t>
-      </w:r>
-      <w:r>
-        <w:rPr>
-          <w:rFonts w:ascii="Aptos" w:hAnsi="Aptos" w:cs="Aptos" w:eastAsia="Aptos"/>
-          <w:color w:val="auto"/>
-          <w:spacing w:val="0"/>
-          <w:position w:val="0"/>
-          <w:sz w:val="24"/>
-          <w:shd w:fill="auto" w:val="clear"/>
-        </w:rPr>
-        <w:t xml:space="preserve"> | Portfolio: </w:t>
-      </w:r>
-      <w:hyperlink xmlns:r="http://schemas.openxmlformats.org/officeDocument/2006/relationships" r:id="docRId3">
+        <w:t xml:space="preserve">github.com/emzuka-cloud | Portfolio: </w:t>
+      </w:r>
+      <w:hyperlink xmlns:r="http://schemas.openxmlformats.org/officeDocument/2006/relationships" r:id="docRId1">
         <w:r>
           <w:rPr>
             <w:rFonts w:ascii="Aptos" w:hAnsi="Aptos" w:cs="Aptos" w:eastAsia="Aptos"/>
-            <w:color w:val="467886"/>
+            <w:color w:val="0000FF"/>
             <w:spacing w:val="0"/>
             <w:position w:val="0"/>
             <w:sz w:val="24"/>
             <w:u w:val="single"/>
             <w:shd w:fill="auto" w:val="clear"/>
           </w:rPr>
-          <w:t xml:space="preserve">emzuka-cloud.github.io/emzuka-cloud.github.io-</w:t>
+          <w:t xml:space="preserve">https://emzuka-cloud.github.io/</w:t>
         </w:r>
       </w:hyperlink>
     </w:p>
@@ -312,7 +301,29 @@
           <w:sz w:val="24"/>
           <w:shd w:fill="auto" w:val="clear"/>
         </w:rPr>
-        <w:t xml:space="preserve"> technologies. Demonstrated ability to manage high-priority tasks and deliver excellent customer service in enterprise environments. Complemented by over 3 years of freelance experience building and integrating web and e-commerce solutions—connecting </w:t>
+        <w:t xml:space="preserve"> technologies. Demonstrated ability to manage high-priority tasks and deliver excellent customer service in enterprise environments. Complemented by over 3 years of freelance experience building and integrating web and e-commerce solutions</w:t>
+      </w:r>
+      <w:r>
+        <w:rPr>
+          <w:rFonts w:ascii="Arial" w:hAnsi="Arial" w:cs="Arial" w:eastAsia="Arial"/>
+          <w:color w:val="auto"/>
+          <w:spacing w:val="0"/>
+          <w:position w:val="0"/>
+          <w:sz w:val="24"/>
+          <w:shd w:fill="auto" w:val="clear"/>
+        </w:rPr>
+        <w:t xml:space="preserve">—</w:t>
+      </w:r>
+      <w:r>
+        <w:rPr>
+          <w:rFonts w:ascii="Aptos" w:hAnsi="Aptos" w:cs="Aptos" w:eastAsia="Aptos"/>
+          <w:color w:val="auto"/>
+          <w:spacing w:val="0"/>
+          <w:position w:val="0"/>
+          <w:sz w:val="24"/>
+          <w:shd w:fill="auto" w:val="clear"/>
+        </w:rPr>
+        <w:t xml:space="preserve">connecting </w:t>
       </w:r>
       <w:r>
         <w:rPr>
@@ -514,7 +525,51 @@
           <w:sz w:val="24"/>
           <w:shd w:fill="auto" w:val="clear"/>
         </w:rPr>
-        <w:t xml:space="preserve"> — including payment gateways (Stripe, PayPal), shipping providers, and booking platforms — to automate client orders, inventory, and operations.</w:t>
+        <w:t xml:space="preserve"> </w:t>
+      </w:r>
+      <w:r>
+        <w:rPr>
+          <w:rFonts w:ascii="Arial" w:hAnsi="Arial" w:cs="Arial" w:eastAsia="Arial"/>
+          <w:color w:val="auto"/>
+          <w:spacing w:val="0"/>
+          <w:position w:val="0"/>
+          <w:sz w:val="24"/>
+          <w:shd w:fill="auto" w:val="clear"/>
+        </w:rPr>
+        <w:t xml:space="preserve">—</w:t>
+      </w:r>
+      <w:r>
+        <w:rPr>
+          <w:rFonts w:ascii="Aptos" w:hAnsi="Aptos" w:cs="Aptos" w:eastAsia="Aptos"/>
+          <w:color w:val="auto"/>
+          <w:spacing w:val="0"/>
+          <w:position w:val="0"/>
+          <w:sz w:val="24"/>
+          <w:shd w:fill="auto" w:val="clear"/>
+        </w:rPr>
+        <w:t xml:space="preserve"> including payment gateways (Stripe, PayPal), shipping providers, and booking platforms </w:t>
+      </w:r>
+      <w:r>
+        <w:rPr>
+          <w:rFonts w:ascii="Calibri" w:hAnsi="Calibri" w:cs="Calibri" w:eastAsia="Calibri"/>
+          <w:color w:val="auto"/>
+          <w:spacing w:val="0"/>
+          <w:position w:val="0"/>
+          <w:sz w:val="24"/>
+          <w:shd w:fill="auto" w:val="clear"/>
+        </w:rPr>
+        <w:t xml:space="preserve">—</w:t>
+      </w:r>
+      <w:r>
+        <w:rPr>
+          <w:rFonts w:ascii="Aptos" w:hAnsi="Aptos" w:cs="Aptos" w:eastAsia="Aptos"/>
+          <w:color w:val="auto"/>
+          <w:spacing w:val="0"/>
+          <w:position w:val="0"/>
+          <w:sz w:val="24"/>
+          <w:shd w:fill="auto" w:val="clear"/>
+        </w:rPr>
+        <w:t xml:space="preserve"> to automate client orders, inventory, and operations.</w:t>
       </w:r>
     </w:p>
     <w:p>
@@ -754,7 +809,7 @@
       <w:pPr>
         <w:numPr>
           <w:ilvl w:val="0"/>
-          <w:numId w:val="8"/>
+          <w:numId w:val="11"/>
         </w:numPr>
         <w:spacing w:before="240" w:after="240" w:line="279"/>
         <w:ind w:right="0" w:left="720" w:hanging="360"/>
@@ -784,7 +839,7 @@
       <w:pPr>
         <w:numPr>
           <w:ilvl w:val="0"/>
-          <w:numId w:val="8"/>
+          <w:numId w:val="11"/>
         </w:numPr>
         <w:spacing w:before="240" w:after="240" w:line="279"/>
         <w:ind w:right="0" w:left="720" w:hanging="360"/>
@@ -860,7 +915,7 @@
       <w:pPr>
         <w:numPr>
           <w:ilvl w:val="0"/>
-          <w:numId w:val="8"/>
+          <w:numId w:val="11"/>
         </w:numPr>
         <w:spacing w:before="240" w:after="240" w:line="279"/>
         <w:ind w:right="0" w:left="720" w:hanging="360"/>
@@ -913,7 +968,7 @@
       <w:pPr>
         <w:numPr>
           <w:ilvl w:val="0"/>
-          <w:numId w:val="8"/>
+          <w:numId w:val="11"/>
         </w:numPr>
         <w:spacing w:before="240" w:after="240" w:line="279"/>
         <w:ind w:right="0" w:left="720" w:hanging="360"/>
@@ -966,7 +1021,7 @@
       <w:pPr>
         <w:numPr>
           <w:ilvl w:val="0"/>
-          <w:numId w:val="8"/>
+          <w:numId w:val="11"/>
         </w:numPr>
         <w:spacing w:before="240" w:after="240" w:line="279"/>
         <w:ind w:right="0" w:left="720" w:hanging="360"/>
@@ -1019,7 +1074,7 @@
       <w:pPr>
         <w:numPr>
           <w:ilvl w:val="0"/>
-          <w:numId w:val="8"/>
+          <w:numId w:val="11"/>
         </w:numPr>
         <w:spacing w:before="240" w:after="240" w:line="279"/>
         <w:ind w:right="0" w:left="720" w:hanging="360"/>
@@ -1049,7 +1104,7 @@
       <w:pPr>
         <w:numPr>
           <w:ilvl w:val="0"/>
-          <w:numId w:val="8"/>
+          <w:numId w:val="11"/>
         </w:numPr>
         <w:spacing w:before="240" w:after="240" w:line="279"/>
         <w:ind w:right="0" w:left="720" w:hanging="360"/>
@@ -1146,7 +1201,7 @@
       <w:pPr>
         <w:numPr>
           <w:ilvl w:val="0"/>
-          <w:numId w:val="11"/>
+          <w:numId w:val="14"/>
         </w:numPr>
         <w:spacing w:before="240" w:after="240" w:line="279"/>
         <w:ind w:right="0" w:left="720" w:hanging="360"/>
@@ -1188,7 +1243,7 @@
       <w:pPr>
         <w:numPr>
           <w:ilvl w:val="0"/>
-          <w:numId w:val="11"/>
+          <w:numId w:val="14"/>
         </w:numPr>
         <w:spacing w:before="240" w:after="240" w:line="279"/>
         <w:ind w:right="0" w:left="720" w:hanging="360"/>
@@ -1230,7 +1285,7 @@
       <w:pPr>
         <w:numPr>
           <w:ilvl w:val="0"/>
-          <w:numId w:val="11"/>
+          <w:numId w:val="14"/>
         </w:numPr>
         <w:spacing w:before="240" w:after="240" w:line="279"/>
         <w:ind w:right="0" w:left="720" w:hanging="360"/>
@@ -1301,7 +1356,7 @@
       <w:pPr>
         <w:numPr>
           <w:ilvl w:val="0"/>
-          <w:numId w:val="13"/>
+          <w:numId w:val="16"/>
         </w:numPr>
         <w:spacing w:before="240" w:after="240" w:line="279"/>
         <w:ind w:right="0" w:left="720" w:hanging="360"/>
@@ -1343,7 +1398,7 @@
       <w:pPr>
         <w:numPr>
           <w:ilvl w:val="0"/>
-          <w:numId w:val="13"/>
+          <w:numId w:val="16"/>
         </w:numPr>
         <w:spacing w:before="240" w:after="240" w:line="279"/>
         <w:ind w:right="0" w:left="720" w:hanging="360"/>
@@ -1385,7 +1440,7 @@
       <w:pPr>
         <w:numPr>
           <w:ilvl w:val="0"/>
-          <w:numId w:val="13"/>
+          <w:numId w:val="16"/>
         </w:numPr>
         <w:spacing w:before="240" w:after="240" w:line="279"/>
         <w:ind w:right="0" w:left="720" w:hanging="360"/>
@@ -1427,7 +1482,7 @@
       <w:pPr>
         <w:numPr>
           <w:ilvl w:val="0"/>
-          <w:numId w:val="13"/>
+          <w:numId w:val="16"/>
         </w:numPr>
         <w:spacing w:before="240" w:after="240" w:line="279"/>
         <w:ind w:right="0" w:left="720" w:hanging="360"/>
@@ -1498,7 +1553,7 @@
       <w:pPr>
         <w:numPr>
           <w:ilvl w:val="0"/>
-          <w:numId w:val="15"/>
+          <w:numId w:val="18"/>
         </w:numPr>
         <w:spacing w:before="240" w:after="240" w:line="279"/>
         <w:ind w:right="0" w:left="720" w:hanging="360"/>
@@ -1540,7 +1595,7 @@
       <w:pPr>
         <w:numPr>
           <w:ilvl w:val="0"/>
-          <w:numId w:val="15"/>
+          <w:numId w:val="18"/>
         </w:numPr>
         <w:spacing w:before="240" w:after="240" w:line="279"/>
         <w:ind w:right="0" w:left="720" w:hanging="360"/>
@@ -1582,7 +1637,7 @@
       <w:pPr>
         <w:numPr>
           <w:ilvl w:val="0"/>
-          <w:numId w:val="15"/>
+          <w:numId w:val="18"/>
         </w:numPr>
         <w:spacing w:before="240" w:after="240" w:line="279"/>
         <w:ind w:right="0" w:left="720" w:hanging="360"/>
@@ -1624,7 +1679,7 @@
       <w:pPr>
         <w:numPr>
           <w:ilvl w:val="0"/>
-          <w:numId w:val="15"/>
+          <w:numId w:val="18"/>
         </w:numPr>
         <w:spacing w:before="240" w:after="240" w:line="279"/>
         <w:ind w:right="0" w:left="720" w:hanging="360"/>
@@ -1695,7 +1750,7 @@
       <w:pPr>
         <w:numPr>
           <w:ilvl w:val="0"/>
-          <w:numId w:val="17"/>
+          <w:numId w:val="20"/>
         </w:numPr>
         <w:spacing w:before="240" w:after="240" w:line="279"/>
         <w:ind w:right="0" w:left="720" w:hanging="360"/>
@@ -1737,7 +1792,7 @@
       <w:pPr>
         <w:numPr>
           <w:ilvl w:val="0"/>
-          <w:numId w:val="17"/>
+          <w:numId w:val="20"/>
         </w:numPr>
         <w:spacing w:before="240" w:after="240" w:line="279"/>
         <w:ind w:right="0" w:left="720" w:hanging="360"/>
@@ -1779,7 +1834,7 @@
       <w:pPr>
         <w:numPr>
           <w:ilvl w:val="0"/>
-          <w:numId w:val="17"/>
+          <w:numId w:val="20"/>
         </w:numPr>
         <w:spacing w:before="240" w:after="240" w:line="279"/>
         <w:ind w:right="0" w:left="720" w:hanging="360"/>
@@ -1821,7 +1876,7 @@
       <w:pPr>
         <w:numPr>
           <w:ilvl w:val="0"/>
-          <w:numId w:val="17"/>
+          <w:numId w:val="20"/>
         </w:numPr>
         <w:spacing w:before="240" w:after="240" w:line="279"/>
         <w:ind w:right="0" w:left="720" w:hanging="360"/>
@@ -1892,7 +1947,7 @@
       <w:pPr>
         <w:numPr>
           <w:ilvl w:val="0"/>
-          <w:numId w:val="19"/>
+          <w:numId w:val="22"/>
         </w:numPr>
         <w:spacing w:before="240" w:after="240" w:line="279"/>
         <w:ind w:right="0" w:left="720" w:hanging="360"/>
@@ -1934,7 +1989,7 @@
       <w:pPr>
         <w:numPr>
           <w:ilvl w:val="0"/>
-          <w:numId w:val="19"/>
+          <w:numId w:val="22"/>
         </w:numPr>
         <w:spacing w:before="240" w:after="240" w:line="279"/>
         <w:ind w:right="0" w:left="720" w:hanging="360"/>
@@ -2035,22 +2090,32 @@
       <w:lvlText w:val="•"/>
     </w:lvl>
   </w:abstractNum>
+  <w:abstractNum w:abstractNumId="36">
+    <w:lvl w:ilvl="0">
+      <w:start w:val="1"/>
+      <w:numFmt w:val="bullet"/>
+      <w:lvlText w:val="•"/>
+    </w:lvl>
+  </w:abstractNum>
   <w:num w:numId="8">
+    <w:abstractNumId w:val="36"/>
+  </w:num>
+  <w:num w:numId="11">
     <w:abstractNumId w:val="30"/>
   </w:num>
-  <w:num w:numId="11">
+  <w:num w:numId="14">
     <w:abstractNumId w:val="24"/>
   </w:num>
-  <w:num w:numId="13">
+  <w:num w:numId="16">
     <w:abstractNumId w:val="18"/>
   </w:num>
-  <w:num w:numId="15">
+  <w:num w:numId="18">
     <w:abstractNumId w:val="12"/>
   </w:num>
-  <w:num w:numId="17">
+  <w:num w:numId="20">
     <w:abstractNumId w:val="6"/>
   </w:num>
-  <w:num w:numId="19">
+  <w:num w:numId="22">
     <w:abstractNumId w:val="0"/>
   </w:num>
 </w:numbering>

</xml_diff>